<commit_message>
Justificación del periodo 2000-2026 con análisis de sensibilidad (conteos anteriores a 2000 en OpenAlex y Scopus)
Co-Authored-By: Claude Opus 5.5 <noreply@anthropic.com>
Claude-Session: https://claude.ai/code/session_01NR3H5SF5ebUeE2uAtiMCju
</commit_message>
<xml_diff>
--- a/articulo/articulo_revision_bibliometrica.docx
+++ b/articulo/articulo_revision_bibliometrica.docx
@@ -836,6 +836,77 @@
       </w:pPr>
       <w:r>
         <w:t xml:space="preserve">La cosecha se ejecutó el 29 de octubre de 2026. Sobre esta fecha de corte, 2026 se trata como un año parcial.</w:t>
+      </w:r>
+    </w:p>
+    <w:p>
+      <w:pPr>
+        <w:pStyle w:val="BodyText"/>
+      </w:pPr>
+      <w:r>
+        <w:rPr>
+          <w:bCs/>
+          <w:b/>
+        </w:rPr>
+        <w:t xml:space="preserve">Periodo de búsqueda.</w:t>
+      </w:r>
+      <w:r>
+        <w:t xml:space="preserve"> </w:t>
+      </w:r>
+      <w:r>
+        <w:t xml:space="preserve">Se fijó el periodo 2000-2026 por tres razones:</w:t>
+      </w:r>
+    </w:p>
+    <w:p>
+      <w:pPr>
+        <w:numPr>
+          <w:ilvl w:val="0"/>
+          <w:numId w:val="1003"/>
+        </w:numPr>
+        <w:pStyle w:val="Compact"/>
+      </w:pPr>
+      <w:r>
+        <w:t xml:space="preserve">El objeto de estudio, la biorrefinería evaluada con herramientas de ciclo de vida, es un campo posterior al año 2000.</w:t>
+      </w:r>
+    </w:p>
+    <w:p>
+      <w:pPr>
+        <w:numPr>
+          <w:ilvl w:val="0"/>
+          <w:numId w:val="1003"/>
+        </w:numPr>
+        <w:pStyle w:val="Compact"/>
+      </w:pPr>
+      <w:r>
+        <w:t xml:space="preserve">Los marcos metodológicos que usará la tesis se consolidaron en ese periodo: la revisión de ISO 14040/14044 (ISO, 2006a, 2006b), el marco LCSA (Kloepffer, 2008) y las directrices de ACV-S (UNEP, 2020).</w:t>
+      </w:r>
+    </w:p>
+    <w:p>
+      <w:pPr>
+        <w:numPr>
+          <w:ilvl w:val="0"/>
+          <w:numId w:val="1003"/>
+        </w:numPr>
+        <w:pStyle w:val="Compact"/>
+      </w:pPr>
+      <w:r>
+        <w:t xml:space="preserve">La fecha de corte coincide con el día de la cosecha, para incluir la producción más reciente.</w:t>
+      </w:r>
+    </w:p>
+    <w:p>
+      <w:pPr>
+        <w:pStyle w:val="FirstParagraph"/>
+      </w:pPr>
+      <w:r>
+        <w:t xml:space="preserve">La decisión se contrastó con un análisis de sensibilidad que contó, sin descargarlos, los documentos anteriores a 2000 en ambas bases (</w:t>
+      </w:r>
+      <w:r>
+        <w:rPr>
+          <w:rStyle w:val="VerbatimChar"/>
+        </w:rPr>
+        <w:t xml:space="preserve">results/tables/period_sensitivity.csv</w:t>
+      </w:r>
+      <w:r>
+        <w:t xml:space="preserve">). Antes de 2000 hay solo 7 documentos en OpenAlex y ninguno en Scopus para N1, ninguno para N2, N6b y N6c, y entre el 1,6 % y el 10,5 % para las consultas de cultivo. La mayor proporción corresponde a los metabolitos del ñame (N4e: 9,1 % en OpenAlex y 10,5 % en Scopus), que reúnen la literatura histórica sobre la diosgenina como precursor de esteroides.</w:t>
       </w:r>
     </w:p>
     <w:bookmarkEnd w:id="23"/>
@@ -2048,81 +2119,12 @@
       <w:pPr>
         <w:numPr>
           <w:ilvl w:val="0"/>
-          <w:numId w:val="1003"/>
+          <w:numId w:val="1004"/>
         </w:numPr>
         <w:pStyle w:val="Compact"/>
       </w:pPr>
       <w:r>
         <w:t xml:space="preserve">El término «ñame» se excluyó de las consultas, porque ambas bases lo normalizan a «name» y recuperaban miles de falsos positivos.</w:t>
-      </w:r>
-    </w:p>
-    <w:p>
-      <w:pPr>
-        <w:numPr>
-          <w:ilvl w:val="0"/>
-          <w:numId w:val="1003"/>
-        </w:numPr>
-        <w:pStyle w:val="Compact"/>
-      </w:pPr>
-      <w:r>
-        <w:t xml:space="preserve">En Scopus, el comodín</w:t>
-      </w:r>
-      <w:r>
-        <w:t xml:space="preserve"> </w:t>
-      </w:r>
-      <w:r>
-        <w:rPr>
-          <w:rStyle w:val="VerbatimChar"/>
-        </w:rPr>
-        <w:t xml:space="preserve">yam*</w:t>
-      </w:r>
-      <w:r>
-        <w:t xml:space="preserve"> </w:t>
-      </w:r>
-      <w:r>
-        <w:t xml:space="preserve">se reemplazó por</w:t>
-      </w:r>
-      <w:r>
-        <w:t xml:space="preserve"> </w:t>
-      </w:r>
-      <w:r>
-        <w:rPr>
-          <w:rStyle w:val="VerbatimChar"/>
-        </w:rPr>
-        <w:t xml:space="preserve">(yam OR yams)</w:t>
-      </w:r>
-      <w:r>
-        <w:t xml:space="preserve">, porque recuperaba documentos sobre la prueba econométrica de Toda-Yamamoto y el proyecto gasífero Yamal.</w:t>
-      </w:r>
-    </w:p>
-    <w:p>
-      <w:pPr>
-        <w:numPr>
-          <w:ilvl w:val="0"/>
-          <w:numId w:val="1003"/>
-        </w:numPr>
-        <w:pStyle w:val="Compact"/>
-      </w:pPr>
-      <w:r>
-        <w:t xml:space="preserve">Las expresiones de evaluación económica se separaron en dos categorías: TEA de procesos y análisis económico agrícola o de mercado.</w:t>
-      </w:r>
-    </w:p>
-    <w:bookmarkEnd w:id="24"/>
-    <w:bookmarkStart w:id="25" w:name="depuración-y-elegibilidad"/>
-    <w:p>
-      <w:pPr>
-        <w:pStyle w:val="Heading2"/>
-      </w:pPr>
-      <w:r>
-        <w:t xml:space="preserve">2.4 Depuración y elegibilidad</w:t>
-      </w:r>
-    </w:p>
-    <w:p>
-      <w:pPr>
-        <w:pStyle w:val="FirstParagraph"/>
-      </w:pPr>
-      <w:r>
-        <w:t xml:space="preserve">Los registros de ambas bases se fusionaron y se deduplicaron, primero por DOI y luego por título normalizado más año. Se excluyeron:</w:t>
       </w:r>
     </w:p>
     <w:p>
@@ -2134,7 +2136,34 @@
         <w:pStyle w:val="Compact"/>
       </w:pPr>
       <w:r>
-        <w:t xml:space="preserve">los documentos sin título, los retractados y los que estaban fuera de periodo o de tipo documental;</w:t>
+        <w:t xml:space="preserve">En Scopus, el comodín</w:t>
+      </w:r>
+      <w:r>
+        <w:t xml:space="preserve"> </w:t>
+      </w:r>
+      <w:r>
+        <w:rPr>
+          <w:rStyle w:val="VerbatimChar"/>
+        </w:rPr>
+        <w:t xml:space="preserve">yam*</w:t>
+      </w:r>
+      <w:r>
+        <w:t xml:space="preserve"> </w:t>
+      </w:r>
+      <w:r>
+        <w:t xml:space="preserve">se reemplazó por</w:t>
+      </w:r>
+      <w:r>
+        <w:t xml:space="preserve"> </w:t>
+      </w:r>
+      <w:r>
+        <w:rPr>
+          <w:rStyle w:val="VerbatimChar"/>
+        </w:rPr>
+        <w:t xml:space="preserve">(yam OR yams)</w:t>
+      </w:r>
+      <w:r>
+        <w:t xml:space="preserve">, porque recuperaba documentos sobre la prueba econométrica de Toda-Yamamoto y el proyecto gasífero Yamal.</w:t>
       </w:r>
     </w:p>
     <w:p>
@@ -2146,7 +2175,17 @@
         <w:pStyle w:val="Compact"/>
       </w:pPr>
       <w:r>
-        <w:t xml:space="preserve">los registros de Scopus que no pudieron enlazarse con metadatos completos.</w:t>
+        <w:t xml:space="preserve">Las expresiones de evaluación económica se separaron en dos categorías: TEA de procesos y análisis económico agrícola o de mercado.</w:t>
+      </w:r>
+    </w:p>
+    <w:bookmarkEnd w:id="24"/>
+    <w:bookmarkStart w:id="25" w:name="depuración-y-elegibilidad"/>
+    <w:p>
+      <w:pPr>
+        <w:pStyle w:val="Heading2"/>
+      </w:pPr>
+      <w:r>
+        <w:t xml:space="preserve">2.4 Depuración y elegibilidad</w:t>
       </w:r>
     </w:p>
     <w:p>
@@ -2154,43 +2193,7 @@
         <w:pStyle w:val="FirstParagraph"/>
       </w:pPr>
       <w:r>
-        <w:t xml:space="preserve">Los falsos positivos se controlaron con una verificación léxica automatizada sobre el título, el resumen y las palabras clave. Por ejemplo, se eliminaron los registros de</w:t>
-      </w:r>
-      <w:r>
-        <w:t xml:space="preserve"> </w:t>
-      </w:r>
-      <w:r>
-        <w:rPr>
-          <w:iCs/>
-          <w:i/>
-        </w:rPr>
-        <w:t xml:space="preserve">yam bean</w:t>
-      </w:r>
-      <w:r>
-        <w:t xml:space="preserve"> </w:t>
-      </w:r>
-      <w:r>
-        <w:t xml:space="preserve">(</w:t>
-      </w:r>
-      <w:r>
-        <w:rPr>
-          <w:iCs/>
-          <w:i/>
-        </w:rPr>
-        <w:t xml:space="preserve">Pachyrhizus</w:t>
-      </w:r>
-      <w:r>
-        <w:t xml:space="preserve">), los de N1 sin mención a biorrefinerías y los de N6 sin vínculo explícito con Colombia. Cuando OpenAlex no distribuía el resumen de un registro (como ocurre con parte de los resúmenes de Elsevier), su coincidencia temática se dio por confirmada si Scopus lo había recuperado con la misma consulta TITLE-ABS-KEY. Cada exclusión quedó registrada con su motivo.</w:t>
-      </w:r>
-    </w:p>
-    <w:bookmarkEnd w:id="25"/>
-    <w:bookmarkStart w:id="26" w:name="análisis"/>
-    <w:p>
-      <w:pPr>
-        <w:pStyle w:val="Heading2"/>
-      </w:pPr>
-      <w:r>
-        <w:t xml:space="preserve">2.5 Análisis</w:t>
+        <w:t xml:space="preserve">Los registros de ambas bases se fusionaron y se deduplicaron, primero por DOI y luego por título normalizado más año. Se excluyeron:</w:t>
       </w:r>
     </w:p>
     <w:p>
@@ -2202,33 +2205,7 @@
         <w:pStyle w:val="Compact"/>
       </w:pPr>
       <w:r>
-        <w:rPr>
-          <w:bCs/>
-          <w:b/>
-        </w:rPr>
-        <w:t xml:space="preserve">Desempeño:</w:t>
-      </w:r>
-      <w:r>
-        <w:t xml:space="preserve"> </w:t>
-      </w:r>
-      <w:r>
-        <w:t xml:space="preserve">producción anual, tasa de crecimiento anual compuesta (TCAC) hasta 2025, citas por documento, índice</w:t>
-      </w:r>
-      <w:r>
-        <w:t xml:space="preserve"> </w:t>
-      </w:r>
-      <w:r>
-        <w:rPr>
-          <w:iCs/>
-          <w:i/>
-        </w:rPr>
-        <w:t xml:space="preserve">h</w:t>
-      </w:r>
-      <w:r>
-        <w:t xml:space="preserve"> </w:t>
-      </w:r>
-      <w:r>
-        <w:t xml:space="preserve">de cada corpus y colaboración internacional, distinguiendo publicaciones de un solo país (SCP) y multinacionales (MCP).</w:t>
+        <w:t xml:space="preserve">los documentos sin título, los retractados y los que estaban fuera de periodo o de tipo documental;</w:t>
       </w:r>
     </w:p>
     <w:p>
@@ -2240,73 +2217,105 @@
         <w:pStyle w:val="Compact"/>
       </w:pPr>
       <w:r>
-        <w:rPr>
-          <w:bCs/>
-          <w:b/>
-        </w:rPr>
-        <w:t xml:space="preserve">Leyes bibliométricas:</w:t>
+        <w:t xml:space="preserve">los registros de Scopus que no pudieron enlazarse con metadatos completos.</w:t>
+      </w:r>
+    </w:p>
+    <w:p>
+      <w:pPr>
+        <w:pStyle w:val="FirstParagraph"/>
+      </w:pPr>
+      <w:r>
+        <w:t xml:space="preserve">Los falsos positivos se controlaron con una verificación léxica automatizada sobre el título, el resumen y las palabras clave. Por ejemplo, se eliminaron los registros de</w:t>
+      </w:r>
+      <w:r>
+        <w:t xml:space="preserve"> </w:t>
+      </w:r>
+      <w:r>
+        <w:rPr>
+          <w:iCs/>
+          <w:i/>
+        </w:rPr>
+        <w:t xml:space="preserve">yam bean</w:t>
+      </w:r>
+      <w:r>
+        <w:t xml:space="preserve"> </w:t>
+      </w:r>
+      <w:r>
+        <w:t xml:space="preserve">(</w:t>
+      </w:r>
+      <w:r>
+        <w:rPr>
+          <w:iCs/>
+          <w:i/>
+        </w:rPr>
+        <w:t xml:space="preserve">Pachyrhizus</w:t>
+      </w:r>
+      <w:r>
+        <w:t xml:space="preserve">), los de N1 sin mención a biorrefinerías y los de N6 sin vínculo explícito con Colombia. Cuando OpenAlex no distribuía el resumen de un registro (como ocurre con parte de los resúmenes de Elsevier), su coincidencia temática se dio por confirmada si Scopus lo había recuperado con la misma consulta TITLE-ABS-KEY. Cada exclusión quedó registrada con su motivo.</w:t>
+      </w:r>
+    </w:p>
+    <w:bookmarkEnd w:id="25"/>
+    <w:bookmarkStart w:id="26" w:name="análisis"/>
+    <w:p>
+      <w:pPr>
+        <w:pStyle w:val="Heading2"/>
+      </w:pPr>
+      <w:r>
+        <w:t xml:space="preserve">2.5 Análisis</w:t>
       </w:r>
     </w:p>
     <w:p>
       <w:pPr>
         <w:numPr>
-          <w:ilvl w:val="1"/>
+          <w:ilvl w:val="0"/>
           <w:numId w:val="1006"/>
         </w:numPr>
         <w:pStyle w:val="Compact"/>
       </w:pPr>
       <w:r>
-        <w:t xml:space="preserve">ley de Bradford, para identificar el núcleo de revistas que concentra un tercio de la producción (Bradford, 1934);</w:t>
+        <w:rPr>
+          <w:bCs/>
+          <w:b/>
+        </w:rPr>
+        <w:t xml:space="preserve">Desempeño:</w:t>
+      </w:r>
+      <w:r>
+        <w:t xml:space="preserve"> </w:t>
+      </w:r>
+      <w:r>
+        <w:t xml:space="preserve">producción anual, tasa de crecimiento anual compuesta (TCAC) hasta 2025, citas por documento, índice</w:t>
+      </w:r>
+      <w:r>
+        <w:t xml:space="preserve"> </w:t>
+      </w:r>
+      <w:r>
+        <w:rPr>
+          <w:iCs/>
+          <w:i/>
+        </w:rPr>
+        <w:t xml:space="preserve">h</w:t>
+      </w:r>
+      <w:r>
+        <w:t xml:space="preserve"> </w:t>
+      </w:r>
+      <w:r>
+        <w:t xml:space="preserve">de cada corpus y colaboración internacional, distinguiendo publicaciones de un solo país (SCP) y multinacionales (MCP).</w:t>
       </w:r>
     </w:p>
     <w:p>
       <w:pPr>
         <w:numPr>
-          <w:ilvl w:val="1"/>
+          <w:ilvl w:val="0"/>
           <w:numId w:val="1006"/>
         </w:numPr>
         <w:pStyle w:val="Compact"/>
       </w:pPr>
       <w:r>
-        <w:t xml:space="preserve">ley de Lotka, ajustada en escala log-log y contrastada con la prueba de Kolmogorov-Smirnov con α = 0,01 (Lotka, 1926; Pao, 1985).</w:t>
-      </w:r>
-    </w:p>
-    <w:p>
-      <w:pPr>
-        <w:numPr>
-          <w:ilvl w:val="0"/>
-          <w:numId w:val="1005"/>
-        </w:numPr>
-        <w:pStyle w:val="Compact"/>
-      </w:pPr>
-      <w:r>
         <w:rPr>
           <w:bCs/>
           <w:b/>
         </w:rPr>
-        <w:t xml:space="preserve">Base intelectual:</w:t>
-      </w:r>
-      <w:r>
-        <w:t xml:space="preserve"> </w:t>
-      </w:r>
-      <w:r>
-        <w:t xml:space="preserve">referencias más citadas localmente en cada nivel.</w:t>
-      </w:r>
-    </w:p>
-    <w:p>
-      <w:pPr>
-        <w:numPr>
-          <w:ilvl w:val="0"/>
-          <w:numId w:val="1005"/>
-        </w:numPr>
-        <w:pStyle w:val="Compact"/>
-      </w:pPr>
-      <w:r>
-        <w:rPr>
-          <w:bCs/>
-          <w:b/>
-        </w:rPr>
-        <w:t xml:space="preserve">Mapeo científico:</w:t>
+        <w:t xml:space="preserve">Leyes bibliométricas:</w:t>
       </w:r>
     </w:p>
     <w:p>
@@ -2318,7 +2327,7 @@
         <w:pStyle w:val="Compact"/>
       </w:pPr>
       <w:r>
-        <w:t xml:space="preserve">redes de co-ocurrencia de palabras clave normalizadas con un tesauro, ponderadas por la fuerza de asociación (van Eck y Waltman, 2009) y agrupadas con el algoritmo de Louvain (Blondel et al., 2008);</w:t>
+        <w:t xml:space="preserve">ley de Bradford, para identificar el núcleo de revistas que concentra un tercio de la producción (Bradford, 1934);</w:t>
       </w:r>
     </w:p>
     <w:p>
@@ -2330,26 +2339,36 @@
         <w:pStyle w:val="Compact"/>
       </w:pPr>
       <w:r>
-        <w:t xml:space="preserve">mapas temáticos de centralidad y densidad construidos con el índice de equivalencia (Callon et al., 1991; Cobo et al., 2011);</w:t>
+        <w:t xml:space="preserve">ley de Lotka, ajustada en escala log-log y contrastada con la prueba de Kolmogorov-Smirnov con α = 0,01 (Lotka, 1926; Pao, 1985).</w:t>
       </w:r>
     </w:p>
     <w:p>
       <w:pPr>
         <w:numPr>
-          <w:ilvl w:val="1"/>
-          <w:numId w:val="1007"/>
+          <w:ilvl w:val="0"/>
+          <w:numId w:val="1006"/>
         </w:numPr>
         <w:pStyle w:val="Compact"/>
       </w:pPr>
       <w:r>
-        <w:t xml:space="preserve">evolución temática en tres periodos: 2000-2015, 2016-2020 y 2021-2026.</w:t>
+        <w:rPr>
+          <w:bCs/>
+          <w:b/>
+        </w:rPr>
+        <w:t xml:space="preserve">Base intelectual:</w:t>
+      </w:r>
+      <w:r>
+        <w:t xml:space="preserve"> </w:t>
+      </w:r>
+      <w:r>
+        <w:t xml:space="preserve">referencias más citadas localmente en cada nivel.</w:t>
       </w:r>
     </w:p>
     <w:p>
       <w:pPr>
         <w:numPr>
           <w:ilvl w:val="0"/>
-          <w:numId w:val="1005"/>
+          <w:numId w:val="1006"/>
         </w:numPr>
         <w:pStyle w:val="Compact"/>
       </w:pPr>
@@ -2358,35 +2377,7 @@
           <w:bCs/>
           <w:b/>
         </w:rPr>
-        <w:t xml:space="preserve">Análisis de brechas:</w:t>
-      </w:r>
-      <w:r>
-        <w:t xml:space="preserve"> </w:t>
-      </w:r>
-      <w:r>
-        <w:t xml:space="preserve">el corpus de N3 a N5 se clasificó con diccionarios controlados por cultivo (yuca, papa, ñame, batata, malanga/taro), por ruta de transformación y por método de evaluación. Con esa clasificación se construyeron matrices de cobertura y se midió el grado de integración: documentos con dos o más rutas fijas y con dos o tres pilares de sostenibilidad.</w:t>
-      </w:r>
-    </w:p>
-    <w:p>
-      <w:pPr>
-        <w:numPr>
-          <w:ilvl w:val="0"/>
-          <w:numId w:val="1005"/>
-        </w:numPr>
-        <w:pStyle w:val="Compact"/>
-      </w:pPr>
-      <w:r>
-        <w:rPr>
-          <w:bCs/>
-          <w:b/>
-        </w:rPr>
-        <w:t xml:space="preserve">Priorización de metabolitos:</w:t>
-      </w:r>
-      <w:r>
-        <w:t xml:space="preserve"> </w:t>
-      </w:r>
-      <w:r>
-        <w:t xml:space="preserve">se calculó un índice normalizado por cultivo con cuatro componentes:</w:t>
+        <w:t xml:space="preserve">Mapeo científico:</w:t>
       </w:r>
     </w:p>
     <w:p>
@@ -2398,7 +2389,7 @@
         <w:pStyle w:val="Compact"/>
       </w:pPr>
       <w:r>
-        <w:t xml:space="preserve">volumen de documentos (peso 0,35);</w:t>
+        <w:t xml:space="preserve">redes de co-ocurrencia de palabras clave normalizadas con un tesauro, ponderadas por la fuerza de asociación (van Eck y Waltman, 2009) y agrupadas con el algoritmo de Louvain (Blondel et al., 2008);</w:t>
       </w:r>
     </w:p>
     <w:p>
@@ -2410,7 +2401,7 @@
         <w:pStyle w:val="Compact"/>
       </w:pPr>
       <w:r>
-        <w:t xml:space="preserve">proporción publicada desde 2021 (0,25);</w:t>
+        <w:t xml:space="preserve">mapas temáticos de centralidad y densidad construidos con el índice de equivalencia (Callon et al., 1991; Cobo et al., 2011);</w:t>
       </w:r>
     </w:p>
     <w:p>
@@ -2422,14 +2413,94 @@
         <w:pStyle w:val="Compact"/>
       </w:pPr>
       <w:r>
-        <w:t xml:space="preserve">proporción que obtiene el metabolito de residuos o subproductos (0,25);</w:t>
+        <w:t xml:space="preserve">evolución temática en tres periodos: 2000-2015, 2016-2020 y 2021-2026.</w:t>
+      </w:r>
+    </w:p>
+    <w:p>
+      <w:pPr>
+        <w:numPr>
+          <w:ilvl w:val="0"/>
+          <w:numId w:val="1006"/>
+        </w:numPr>
+        <w:pStyle w:val="Compact"/>
+      </w:pPr>
+      <w:r>
+        <w:rPr>
+          <w:bCs/>
+          <w:b/>
+        </w:rPr>
+        <w:t xml:space="preserve">Análisis de brechas:</w:t>
+      </w:r>
+      <w:r>
+        <w:t xml:space="preserve"> </w:t>
+      </w:r>
+      <w:r>
+        <w:t xml:space="preserve">el corpus de N3 a N5 se clasificó con diccionarios controlados por cultivo (yuca, papa, ñame, batata, malanga/taro), por ruta de transformación y por método de evaluación. Con esa clasificación se construyeron matrices de cobertura y se midió el grado de integración: documentos con dos o más rutas fijas y con dos o tres pilares de sostenibilidad.</w:t>
+      </w:r>
+    </w:p>
+    <w:p>
+      <w:pPr>
+        <w:numPr>
+          <w:ilvl w:val="0"/>
+          <w:numId w:val="1006"/>
+        </w:numPr>
+        <w:pStyle w:val="Compact"/>
+      </w:pPr>
+      <w:r>
+        <w:rPr>
+          <w:bCs/>
+          <w:b/>
+        </w:rPr>
+        <w:t xml:space="preserve">Priorización de metabolitos:</w:t>
+      </w:r>
+      <w:r>
+        <w:t xml:space="preserve"> </w:t>
+      </w:r>
+      <w:r>
+        <w:t xml:space="preserve">se calculó un índice normalizado por cultivo con cuatro componentes:</w:t>
       </w:r>
     </w:p>
     <w:p>
       <w:pPr>
         <w:numPr>
           <w:ilvl w:val="1"/>
-          <w:numId w:val="1008"/>
+          <w:numId w:val="1009"/>
+        </w:numPr>
+        <w:pStyle w:val="Compact"/>
+      </w:pPr>
+      <w:r>
+        <w:t xml:space="preserve">volumen de documentos (peso 0,35);</w:t>
+      </w:r>
+    </w:p>
+    <w:p>
+      <w:pPr>
+        <w:numPr>
+          <w:ilvl w:val="1"/>
+          <w:numId w:val="1009"/>
+        </w:numPr>
+        <w:pStyle w:val="Compact"/>
+      </w:pPr>
+      <w:r>
+        <w:t xml:space="preserve">proporción publicada desde 2021 (0,25);</w:t>
+      </w:r>
+    </w:p>
+    <w:p>
+      <w:pPr>
+        <w:numPr>
+          <w:ilvl w:val="1"/>
+          <w:numId w:val="1009"/>
+        </w:numPr>
+        <w:pStyle w:val="Compact"/>
+      </w:pPr>
+      <w:r>
+        <w:t xml:space="preserve">proporción que obtiene el metabolito de residuos o subproductos (0,25);</w:t>
+      </w:r>
+    </w:p>
+    <w:p>
+      <w:pPr>
+        <w:numPr>
+          <w:ilvl w:val="1"/>
+          <w:numId w:val="1009"/>
         </w:numPr>
         <w:pStyle w:val="Compact"/>
       </w:pPr>
@@ -4010,7 +4081,7 @@
       <w:pPr>
         <w:numPr>
           <w:ilvl w:val="0"/>
-          <w:numId w:val="1009"/>
+          <w:numId w:val="1010"/>
         </w:numPr>
         <w:pStyle w:val="Compact"/>
       </w:pPr>
@@ -4026,158 +4097,6 @@
       </w:r>
       <w:r>
         <w:t xml:space="preserve">ACV, biocombustibles y economía circular (C1).</w:t>
-      </w:r>
-    </w:p>
-    <w:p>
-      <w:pPr>
-        <w:numPr>
-          <w:ilvl w:val="0"/>
-          <w:numId w:val="1009"/>
-        </w:numPr>
-        <w:pStyle w:val="Compact"/>
-      </w:pPr>
-      <w:r>
-        <w:rPr>
-          <w:bCs/>
-          <w:b/>
-        </w:rPr>
-        <w:t xml:space="preserve">Tema básico o transversal:</w:t>
-      </w:r>
-      <w:r>
-        <w:t xml:space="preserve"> </w:t>
-      </w:r>
-      <w:r>
-        <w:t xml:space="preserve">TEA de biomasa lignocelulósica para bioetanol (C2).</w:t>
-      </w:r>
-    </w:p>
-    <w:p>
-      <w:pPr>
-        <w:numPr>
-          <w:ilvl w:val="0"/>
-          <w:numId w:val="1009"/>
-        </w:numPr>
-        <w:pStyle w:val="Compact"/>
-      </w:pPr>
-      <w:r>
-        <w:rPr>
-          <w:bCs/>
-          <w:b/>
-        </w:rPr>
-        <w:t xml:space="preserve">Nicho:</w:t>
-      </w:r>
-      <w:r>
-        <w:t xml:space="preserve"> </w:t>
-      </w:r>
-      <w:r>
-        <w:t xml:space="preserve">factibilidad económica de digestión anaerobia y microalgas (C3).</w:t>
-      </w:r>
-    </w:p>
-    <w:p>
-      <w:pPr>
-        <w:pStyle w:val="FirstParagraph"/>
-      </w:pPr>
-      <w:r>
-        <w:t xml:space="preserve">La evolución temática muestra un desplazamiento claro. La presencia del TEA pasó del 30,2 % de los documentos en 2000-2015 al 45,0 % en 2021-2026, y la del ACV del 21,9 % al 33,8 %. La bioeconomía circular, ausente antes de 2016, aparece en el 14,0 % de los documentos recientes. En cambio, el etanol celulósico cayó del 11,4 % al 3,1 % y el rastrojo de maíz del 8,0 % al 3,3 %.</w:t>
-      </w:r>
-    </w:p>
-    <w:bookmarkEnd w:id="38"/>
-    <w:bookmarkStart w:id="39" w:name="n2-integración-de-la-dimensión-social"/>
-    <w:p>
-      <w:pPr>
-        <w:pStyle w:val="Heading2"/>
-      </w:pPr>
-      <w:r>
-        <w:t xml:space="preserve">3.3 N2: integración de la dimensión social</w:t>
-      </w:r>
-    </w:p>
-    <w:p>
-      <w:pPr>
-        <w:pStyle w:val="FirstParagraph"/>
-      </w:pPr>
-      <w:r>
-        <w:t xml:space="preserve">La integración del ACV-S y del marco LCSA en sistemas de base biológica es reciente (desde 2011) y reducida: 159 documentos, frente a 2.978 en N1. Su crecimiento es alto (TCAC del 23,4 %) y la producción es predominantemente europea: Alemania (26 documentos), España (21) e Italia (19). Las fuentes núcleo son</w:t>
-      </w:r>
-      <w:r>
-        <w:t xml:space="preserve"> </w:t>
-      </w:r>
-      <w:r>
-        <w:rPr>
-          <w:iCs/>
-          <w:i/>
-        </w:rPr>
-        <w:t xml:space="preserve">The International Journal of Life Cycle Assessment</w:t>
-      </w:r>
-      <w:r>
-        <w:t xml:space="preserve"> </w:t>
-      </w:r>
-      <w:r>
-        <w:t xml:space="preserve">(21),</w:t>
-      </w:r>
-      <w:r>
-        <w:t xml:space="preserve"> </w:t>
-      </w:r>
-      <w:r>
-        <w:rPr>
-          <w:iCs/>
-          <w:i/>
-        </w:rPr>
-        <w:t xml:space="preserve">Journal of Cleaner Production</w:t>
-      </w:r>
-      <w:r>
-        <w:t xml:space="preserve"> </w:t>
-      </w:r>
-      <w:r>
-        <w:t xml:space="preserve">(16) y</w:t>
-      </w:r>
-      <w:r>
-        <w:t xml:space="preserve"> </w:t>
-      </w:r>
-      <w:r>
-        <w:rPr>
-          <w:iCs/>
-          <w:i/>
-        </w:rPr>
-        <w:t xml:space="preserve">Sustainability</w:t>
-      </w:r>
-      <w:r>
-        <w:t xml:space="preserve"> </w:t>
-      </w:r>
-      <w:r>
-        <w:t xml:space="preserve">(12).</w:t>
-      </w:r>
-    </w:p>
-    <w:p>
-      <w:pPr>
-        <w:pStyle w:val="BodyText"/>
-      </w:pPr>
-      <w:r>
-        <w:t xml:space="preserve">El documento más citado revisa las evaluaciones ambientales, sociales y económicas de los bioplásticos (Spierling et al., 2018). La base intelectual descansa en la Social Hotspot Database (Benoit-Norris et al., 2012), en índices de ACV-S para productos de madera (Siebert et al., 2018), en el ACV-S de biodiésel (Macombe et al., 2013; Manik et al., 2013) y en revisiones de indicadores y marcos (Sala et al., 2013; Kühnen y Hahn, 2017; Lehmann et al., 2013; Ramos Huarachi et al., 2020; Huertas-Valdivia et al., 2020). La aplicación conjunta de LCSA en biorrefinerías se documenta en casos aislados, como el de las macroalgas (Sadhukhan et al., 2019).</w:t>
-      </w:r>
-    </w:p>
-    <w:p>
-      <w:pPr>
-        <w:pStyle w:val="BodyText"/>
-      </w:pPr>
-      <w:r>
-        <w:t xml:space="preserve">El mapa temático ubica a LCSA con toma de decisiones multicriterio, y a ACV con costeo del ciclo de vida, como temas motores. El ACV-S y la sostenibilidad social funcionan como tema básico. La biorrefinería y la bioeconomía circular aparecen como nicho, y la creación de empleo y la salud y seguridad en bioetanol como tema emergente.</w:t>
-      </w:r>
-    </w:p>
-    <w:bookmarkEnd w:id="39"/>
-    <w:bookmarkStart w:id="43" w:name="Xe95dc2bcdcf64228d78768481c7fd5fbde004d2"/>
-    <w:p>
-      <w:pPr>
-        <w:pStyle w:val="Heading2"/>
-      </w:pPr>
-      <w:r>
-        <w:t xml:space="preserve">3.4 N3: raíces y tubérculos como materia prima</w:t>
-      </w:r>
-    </w:p>
-    <w:p>
-      <w:pPr>
-        <w:pStyle w:val="FirstParagraph"/>
-      </w:pPr>
-      <w:r>
-        <w:t xml:space="preserve">N3 reúne 5.016 documentos (TCAC del 15,1 %), con liderazgo de países productores tropicales y emergentes: China (489), Brasil (382), India (347), Nigeria (339) y Tailandia (309). Colombia ocupa el noveno lugar, con 126 documentos. El mapa temático distingue cuatro grupos:</w:t>
       </w:r>
     </w:p>
     <w:p>
@@ -4193,29 +4112,13 @@
           <w:bCs/>
           <w:b/>
         </w:rPr>
-        <w:t xml:space="preserve">Tema motor:</w:t>
-      </w:r>
-      <w:r>
-        <w:t xml:space="preserve"> </w:t>
-      </w:r>
-      <w:r>
-        <w:t xml:space="preserve">producción de bioetanol con</w:t>
-      </w:r>
-      <w:r>
-        <w:t xml:space="preserve"> </w:t>
-      </w:r>
-      <w:r>
-        <w:rPr>
-          <w:iCs/>
-          <w:i/>
-        </w:rPr>
-        <w:t xml:space="preserve">Saccharomyces cerevisiae</w:t>
-      </w:r>
-      <w:r>
-        <w:t xml:space="preserve"> </w:t>
-      </w:r>
-      <w:r>
-        <w:t xml:space="preserve">a partir de residuos agrícolas (C1).</w:t>
+        <w:t xml:space="preserve">Tema básico o transversal:</w:t>
+      </w:r>
+      <w:r>
+        <w:t xml:space="preserve"> </w:t>
+      </w:r>
+      <w:r>
+        <w:t xml:space="preserve">TEA de biomasa lignocelulósica para bioetanol (C2).</w:t>
       </w:r>
     </w:p>
     <w:p>
@@ -4231,20 +4134,128 @@
           <w:bCs/>
           <w:b/>
         </w:rPr>
-        <w:t xml:space="preserve">Tema básico:</w:t>
-      </w:r>
-      <w:r>
-        <w:t xml:space="preserve"> </w:t>
-      </w:r>
-      <w:r>
-        <w:t xml:space="preserve">digestión anaerobia y biogás de cáscaras de yuca y papa (C2).</w:t>
+        <w:t xml:space="preserve">Nicho:</w:t>
+      </w:r>
+      <w:r>
+        <w:t xml:space="preserve"> </w:t>
+      </w:r>
+      <w:r>
+        <w:t xml:space="preserve">factibilidad económica de digestión anaerobia y microalgas (C3).</w:t>
+      </w:r>
+    </w:p>
+    <w:p>
+      <w:pPr>
+        <w:pStyle w:val="FirstParagraph"/>
+      </w:pPr>
+      <w:r>
+        <w:t xml:space="preserve">La evolución temática muestra un desplazamiento claro. La presencia del TEA pasó del 30,2 % de los documentos en 2000-2015 al 45,0 % en 2021-2026, y la del ACV del 21,9 % al 33,8 %. La bioeconomía circular, ausente antes de 2016, aparece en el 14,0 % de los documentos recientes. En cambio, el etanol celulósico cayó del 11,4 % al 3,1 % y el rastrojo de maíz del 8,0 % al 3,3 %.</w:t>
+      </w:r>
+    </w:p>
+    <w:bookmarkEnd w:id="38"/>
+    <w:bookmarkStart w:id="39" w:name="n2-integración-de-la-dimensión-social"/>
+    <w:p>
+      <w:pPr>
+        <w:pStyle w:val="Heading2"/>
+      </w:pPr>
+      <w:r>
+        <w:t xml:space="preserve">3.3 N2: integración de la dimensión social</w:t>
+      </w:r>
+    </w:p>
+    <w:p>
+      <w:pPr>
+        <w:pStyle w:val="FirstParagraph"/>
+      </w:pPr>
+      <w:r>
+        <w:t xml:space="preserve">La integración del ACV-S y del marco LCSA en sistemas de base biológica es reciente (desde 2011) y reducida: 159 documentos, frente a 2.978 en N1. Su crecimiento es alto (TCAC del 23,4 %) y la producción es predominantemente europea: Alemania (26 documentos), España (21) e Italia (19). Las fuentes núcleo son</w:t>
+      </w:r>
+      <w:r>
+        <w:t xml:space="preserve"> </w:t>
+      </w:r>
+      <w:r>
+        <w:rPr>
+          <w:iCs/>
+          <w:i/>
+        </w:rPr>
+        <w:t xml:space="preserve">The International Journal of Life Cycle Assessment</w:t>
+      </w:r>
+      <w:r>
+        <w:t xml:space="preserve"> </w:t>
+      </w:r>
+      <w:r>
+        <w:t xml:space="preserve">(21),</w:t>
+      </w:r>
+      <w:r>
+        <w:t xml:space="preserve"> </w:t>
+      </w:r>
+      <w:r>
+        <w:rPr>
+          <w:iCs/>
+          <w:i/>
+        </w:rPr>
+        <w:t xml:space="preserve">Journal of Cleaner Production</w:t>
+      </w:r>
+      <w:r>
+        <w:t xml:space="preserve"> </w:t>
+      </w:r>
+      <w:r>
+        <w:t xml:space="preserve">(16) y</w:t>
+      </w:r>
+      <w:r>
+        <w:t xml:space="preserve"> </w:t>
+      </w:r>
+      <w:r>
+        <w:rPr>
+          <w:iCs/>
+          <w:i/>
+        </w:rPr>
+        <w:t xml:space="preserve">Sustainability</w:t>
+      </w:r>
+      <w:r>
+        <w:t xml:space="preserve"> </w:t>
+      </w:r>
+      <w:r>
+        <w:t xml:space="preserve">(12).</w:t>
+      </w:r>
+    </w:p>
+    <w:p>
+      <w:pPr>
+        <w:pStyle w:val="BodyText"/>
+      </w:pPr>
+      <w:r>
+        <w:t xml:space="preserve">El documento más citado revisa las evaluaciones ambientales, sociales y económicas de los bioplásticos (Spierling et al., 2018). La base intelectual descansa en la Social Hotspot Database (Benoit-Norris et al., 2012), en índices de ACV-S para productos de madera (Siebert et al., 2018), en el ACV-S de biodiésel (Macombe et al., 2013; Manik et al., 2013) y en revisiones de indicadores y marcos (Sala et al., 2013; Kühnen y Hahn, 2017; Lehmann et al., 2013; Ramos Huarachi et al., 2020; Huertas-Valdivia et al., 2020). La aplicación conjunta de LCSA en biorrefinerías se documenta en casos aislados, como el de las macroalgas (Sadhukhan et al., 2019).</w:t>
+      </w:r>
+    </w:p>
+    <w:p>
+      <w:pPr>
+        <w:pStyle w:val="BodyText"/>
+      </w:pPr>
+      <w:r>
+        <w:t xml:space="preserve">El mapa temático ubica a LCSA con toma de decisiones multicriterio, y a ACV con costeo del ciclo de vida, como temas motores. El ACV-S y la sostenibilidad social funcionan como tema básico. La biorrefinería y la bioeconomía circular aparecen como nicho, y la creación de empleo y la salud y seguridad en bioetanol como tema emergente.</w:t>
+      </w:r>
+    </w:p>
+    <w:bookmarkEnd w:id="39"/>
+    <w:bookmarkStart w:id="43" w:name="Xe95dc2bcdcf64228d78768481c7fd5fbde004d2"/>
+    <w:p>
+      <w:pPr>
+        <w:pStyle w:val="Heading2"/>
+      </w:pPr>
+      <w:r>
+        <w:t xml:space="preserve">3.4 N3: raíces y tubérculos como materia prima</w:t>
+      </w:r>
+    </w:p>
+    <w:p>
+      <w:pPr>
+        <w:pStyle w:val="FirstParagraph"/>
+      </w:pPr>
+      <w:r>
+        <w:t xml:space="preserve">N3 reúne 5.016 documentos (TCAC del 15,1 %), con liderazgo de países productores tropicales y emergentes: China (489), Brasil (382), India (347), Nigeria (339) y Tailandia (309). Colombia ocupa el noveno lugar, con 126 documentos. El mapa temático distingue cuatro grupos:</w:t>
       </w:r>
     </w:p>
     <w:p>
       <w:pPr>
         <w:numPr>
           <w:ilvl w:val="0"/>
-          <w:numId w:val="1010"/>
+          <w:numId w:val="1011"/>
         </w:numPr>
         <w:pStyle w:val="Compact"/>
       </w:pPr>
@@ -4253,20 +4264,80 @@
           <w:bCs/>
           <w:b/>
         </w:rPr>
-        <w:t xml:space="preserve">Nicho:</w:t>
-      </w:r>
-      <w:r>
-        <w:t xml:space="preserve"> </w:t>
-      </w:r>
-      <w:r>
-        <w:t xml:space="preserve">biofertilizantes en el cultivo de papa (C3).</w:t>
+        <w:t xml:space="preserve">Tema motor:</w:t>
+      </w:r>
+      <w:r>
+        <w:t xml:space="preserve"> </w:t>
+      </w:r>
+      <w:r>
+        <w:t xml:space="preserve">producción de bioetanol con</w:t>
+      </w:r>
+      <w:r>
+        <w:t xml:space="preserve"> </w:t>
+      </w:r>
+      <w:r>
+        <w:rPr>
+          <w:iCs/>
+          <w:i/>
+        </w:rPr>
+        <w:t xml:space="preserve">Saccharomyces cerevisiae</w:t>
+      </w:r>
+      <w:r>
+        <w:t xml:space="preserve"> </w:t>
+      </w:r>
+      <w:r>
+        <w:t xml:space="preserve">a partir de residuos agrícolas (C1).</w:t>
       </w:r>
     </w:p>
     <w:p>
       <w:pPr>
         <w:numPr>
           <w:ilvl w:val="0"/>
-          <w:numId w:val="1010"/>
+          <w:numId w:val="1011"/>
+        </w:numPr>
+        <w:pStyle w:val="Compact"/>
+      </w:pPr>
+      <w:r>
+        <w:rPr>
+          <w:bCs/>
+          <w:b/>
+        </w:rPr>
+        <w:t xml:space="preserve">Tema básico:</w:t>
+      </w:r>
+      <w:r>
+        <w:t xml:space="preserve"> </w:t>
+      </w:r>
+      <w:r>
+        <w:t xml:space="preserve">digestión anaerobia y biogás de cáscaras de yuca y papa (C2).</w:t>
+      </w:r>
+    </w:p>
+    <w:p>
+      <w:pPr>
+        <w:numPr>
+          <w:ilvl w:val="0"/>
+          <w:numId w:val="1011"/>
+        </w:numPr>
+        <w:pStyle w:val="Compact"/>
+      </w:pPr>
+      <w:r>
+        <w:rPr>
+          <w:bCs/>
+          <w:b/>
+        </w:rPr>
+        <w:t xml:space="preserve">Nicho:</w:t>
+      </w:r>
+      <w:r>
+        <w:t xml:space="preserve"> </w:t>
+      </w:r>
+      <w:r>
+        <w:t xml:space="preserve">biofertilizantes en el cultivo de papa (C3).</w:t>
+      </w:r>
+    </w:p>
+    <w:p>
+      <w:pPr>
+        <w:numPr>
+          <w:ilvl w:val="0"/>
+          <w:numId w:val="1011"/>
         </w:numPr>
         <w:pStyle w:val="Compact"/>
       </w:pPr>
@@ -5204,7 +5275,7 @@
       <w:pPr>
         <w:numPr>
           <w:ilvl w:val="0"/>
-          <w:numId w:val="1011"/>
+          <w:numId w:val="1012"/>
         </w:numPr>
         <w:pStyle w:val="Compact"/>
       </w:pPr>
@@ -5236,131 +5307,6 @@
       </w:r>
       <w:r>
         <w:t xml:space="preserve">cultivado en Colombia ya existen caracterizaciones de almidones nativos y modificados (Rodríguez‐Manrique et al., 2025). Estos datos son directamente útiles para el inventario del TEA.</w:t>
-      </w:r>
-    </w:p>
-    <w:p>
-      <w:pPr>
-        <w:numPr>
-          <w:ilvl w:val="0"/>
-          <w:numId w:val="1011"/>
-        </w:numPr>
-        <w:pStyle w:val="Compact"/>
-      </w:pPr>
-      <w:r>
-        <w:rPr>
-          <w:bCs/>
-          <w:b/>
-        </w:rPr>
-        <w:t xml:space="preserve">Bioetanol.</w:t>
-      </w:r>
-      <w:r>
-        <w:t xml:space="preserve"> </w:t>
-      </w:r>
-      <w:r>
-        <w:t xml:space="preserve">Predominan los estudios de hidrólisis y fermentación de batata (Lareo et al., 2013). Para el ñame la evidencia es escasa y procede, sobre todo, de África occidental y de residuos del procesamiento farmacéutico de</w:t>
-      </w:r>
-      <w:r>
-        <w:t xml:space="preserve"> </w:t>
-      </w:r>
-      <w:r>
-        <w:rPr>
-          <w:iCs/>
-          <w:i/>
-        </w:rPr>
-        <w:t xml:space="preserve">Dioscorea</w:t>
-      </w:r>
-      <w:r>
-        <w:t xml:space="preserve">.</w:t>
-      </w:r>
-    </w:p>
-    <w:p>
-      <w:pPr>
-        <w:numPr>
-          <w:ilvl w:val="0"/>
-          <w:numId w:val="1011"/>
-        </w:numPr>
-        <w:pStyle w:val="Compact"/>
-      </w:pPr>
-      <w:r>
-        <w:rPr>
-          <w:bCs/>
-          <w:b/>
-        </w:rPr>
-        <w:t xml:space="preserve">Biogás.</w:t>
-      </w:r>
-      <w:r>
-        <w:t xml:space="preserve"> </w:t>
-      </w:r>
-      <w:r>
-        <w:t xml:space="preserve">Hay estudios de co-digestión de batata con estiércol, con evaluación técnico-económica (Montoro et al., 2019), de digestión de ramas de batata (Zhang et al., 2018) y de pretratamiento de cáscara de ñame (Onu et al., 2022). También se ha tratado por vía anaerobia el efluente de la extracción de diosgenina (Cheng et al., 2009).</w:t>
-      </w:r>
-    </w:p>
-    <w:p>
-      <w:pPr>
-        <w:numPr>
-          <w:ilvl w:val="0"/>
-          <w:numId w:val="1011"/>
-        </w:numPr>
-        <w:pStyle w:val="Compact"/>
-      </w:pPr>
-      <w:r>
-        <w:rPr>
-          <w:bCs/>
-          <w:b/>
-        </w:rPr>
-        <w:t xml:space="preserve">Biofertilizante.</w:t>
-      </w:r>
-      <w:r>
-        <w:t xml:space="preserve"> </w:t>
-      </w:r>
-      <w:r>
-        <w:t xml:space="preserve">Es la ruta menos desarrollada como producto de biorrefinería. La literatura se refiere mayoritariamente al efecto de los abonos orgánicos sobre el cultivo (Agbede et al., 2013), no a la transformación de residuos de ñame o batata en un producto fertilizante caracterizado.</w:t>
-      </w:r>
-    </w:p>
-    <w:p>
-      <w:pPr>
-        <w:numPr>
-          <w:ilvl w:val="0"/>
-          <w:numId w:val="1011"/>
-        </w:numPr>
-        <w:pStyle w:val="Compact"/>
-      </w:pPr>
-      <w:r>
-        <w:rPr>
-          <w:bCs/>
-          <w:b/>
-        </w:rPr>
-        <w:t xml:space="preserve">Valorización integral.</w:t>
-      </w:r>
-      <w:r>
-        <w:t xml:space="preserve"> </w:t>
-      </w:r>
-      <w:r>
-        <w:t xml:space="preserve">Existen esquemas en cascada para la batata: bioetanol y bebida destilada a partir de residuos (Weber et al., 2020) y extracción secuencial de proteínas y pectinas con uso del residuo sólido en biocompuestos (Vannini et al., 2021). Para el ñame, la obtención combinada de antocianinas y almidón de</w:t>
-      </w:r>
-      <w:r>
-        <w:t xml:space="preserve"> </w:t>
-      </w:r>
-      <w:r>
-        <w:rPr>
-          <w:iCs/>
-          <w:i/>
-        </w:rPr>
-        <w:t xml:space="preserve">D. alata</w:t>
-      </w:r>
-      <w:r>
-        <w:t xml:space="preserve"> </w:t>
-      </w:r>
-      <w:r>
-        <w:t xml:space="preserve">constituye el antecedente más cercano a una biorrefinería (Ochoa et al., 2023).</w:t>
-      </w:r>
-    </w:p>
-    <w:p>
-      <w:pPr>
-        <w:pStyle w:val="FirstParagraph"/>
-      </w:pPr>
-      <w:r>
-        <w:t xml:space="preserve">El mapa temático de N4 confirma esta orientación:</w:t>
       </w:r>
     </w:p>
     <w:p>
@@ -5376,13 +5322,26 @@
           <w:bCs/>
           <w:b/>
         </w:rPr>
-        <w:t xml:space="preserve">Tema motor:</w:t>
-      </w:r>
-      <w:r>
-        <w:t xml:space="preserve"> </w:t>
-      </w:r>
-      <w:r>
-        <w:t xml:space="preserve">actividad antioxidante, flavonoides, ñame y diosgenina (C2).</w:t>
+        <w:t xml:space="preserve">Bioetanol.</w:t>
+      </w:r>
+      <w:r>
+        <w:t xml:space="preserve"> </w:t>
+      </w:r>
+      <w:r>
+        <w:t xml:space="preserve">Predominan los estudios de hidrólisis y fermentación de batata (Lareo et al., 2013). Para el ñame la evidencia es escasa y procede, sobre todo, de África occidental y de residuos del procesamiento farmacéutico de</w:t>
+      </w:r>
+      <w:r>
+        <w:t xml:space="preserve"> </w:t>
+      </w:r>
+      <w:r>
+        <w:rPr>
+          <w:iCs/>
+          <w:i/>
+        </w:rPr>
+        <w:t xml:space="preserve">Dioscorea</w:t>
+      </w:r>
+      <w:r>
+        <w:t xml:space="preserve">.</w:t>
       </w:r>
     </w:p>
     <w:p>
@@ -5398,13 +5357,13 @@
           <w:bCs/>
           <w:b/>
         </w:rPr>
-        <w:t xml:space="preserve">Tema básico:</w:t>
-      </w:r>
-      <w:r>
-        <w:t xml:space="preserve"> </w:t>
-      </w:r>
-      <w:r>
-        <w:t xml:space="preserve">batata, antocianinas y batata de pulpa morada o naranja (C1).</w:t>
+        <w:t xml:space="preserve">Biogás.</w:t>
+      </w:r>
+      <w:r>
+        <w:t xml:space="preserve"> </w:t>
+      </w:r>
+      <w:r>
+        <w:t xml:space="preserve">Hay estudios de co-digestión de batata con estiércol, con evaluación técnico-económica (Montoro et al., 2019), de digestión de ramas de batata (Zhang et al., 2018) y de pretratamiento de cáscara de ñame (Onu et al., 2022). También se ha tratado por vía anaerobia el efluente de la extracción de diosgenina (Cheng et al., 2009).</w:t>
       </w:r>
     </w:p>
     <w:p>
@@ -5420,13 +5379,35 @@
           <w:bCs/>
           <w:b/>
         </w:rPr>
-        <w:t xml:space="preserve">Nicho:</w:t>
-      </w:r>
-      <w:r>
-        <w:t xml:space="preserve"> </w:t>
-      </w:r>
-      <w:r>
-        <w:t xml:space="preserve">almidón de batata y de</w:t>
+        <w:t xml:space="preserve">Biofertilizante.</w:t>
+      </w:r>
+      <w:r>
+        <w:t xml:space="preserve"> </w:t>
+      </w:r>
+      <w:r>
+        <w:t xml:space="preserve">Es la ruta menos desarrollada como producto de biorrefinería. La literatura se refiere mayoritariamente al efecto de los abonos orgánicos sobre el cultivo (Agbede et al., 2013), no a la transformación de residuos de ñame o batata en un producto fertilizante caracterizado.</w:t>
+      </w:r>
+    </w:p>
+    <w:p>
+      <w:pPr>
+        <w:numPr>
+          <w:ilvl w:val="0"/>
+          <w:numId w:val="1012"/>
+        </w:numPr>
+        <w:pStyle w:val="Compact"/>
+      </w:pPr>
+      <w:r>
+        <w:rPr>
+          <w:bCs/>
+          <w:b/>
+        </w:rPr>
+        <w:t xml:space="preserve">Valorización integral.</w:t>
+      </w:r>
+      <w:r>
+        <w:t xml:space="preserve"> </w:t>
+      </w:r>
+      <w:r>
+        <w:t xml:space="preserve">Existen esquemas en cascada para la batata: bioetanol y bebida destilada a partir de residuos (Weber et al., 2020) y extracción secuencial de proteínas y pectinas con uso del residuo sólido en biocompuestos (Vannini et al., 2021). Para el ñame, la obtención combinada de antocianinas y almidón de</w:t>
       </w:r>
       <w:r>
         <w:t xml:space="preserve"> </w:t>
@@ -5442,7 +5423,7 @@
         <w:t xml:space="preserve"> </w:t>
       </w:r>
       <w:r>
-        <w:t xml:space="preserve">y sus propiedades funcionales (C3).</w:t>
+        <w:t xml:space="preserve">constituye el antecedente más cercano a una biorrefinería (Ochoa et al., 2023).</w:t>
       </w:r>
     </w:p>
     <w:p>
@@ -5450,24 +5431,7 @@
         <w:pStyle w:val="FirstParagraph"/>
       </w:pPr>
       <w:r>
-        <w:t xml:space="preserve">Desde 2000, la proporción de documentos sobre actividad antioxidante pasó del 10,3 % al 16,8 %, la de flavonoides del 4,8 % al 9,3 % y la de alimentos funcionales del 2,5 % al 7,1 %. La diosgenina, en cambio, bajó del 7,3 % al 4,1 %.</w:t>
-      </w:r>
-    </w:p>
-    <w:bookmarkStart w:id="50" w:name="metabolitos-candidatos"/>
-    <w:p>
-      <w:pPr>
-        <w:pStyle w:val="Heading3"/>
-      </w:pPr>
-      <w:r>
-        <w:t xml:space="preserve">Metabolitos candidatos</w:t>
-      </w:r>
-    </w:p>
-    <w:p>
-      <w:pPr>
-        <w:pStyle w:val="FirstParagraph"/>
-      </w:pPr>
-      <w:r>
-        <w:t xml:space="preserve">La minería de metabolitos (Tabla 4, Figura 6) muestra resultados distintos para cada cultivo.</w:t>
+        <w:t xml:space="preserve">El mapa temático de N4 confirma esta orientación:</w:t>
       </w:r>
     </w:p>
     <w:p>
@@ -5483,13 +5447,13 @@
           <w:bCs/>
           <w:b/>
         </w:rPr>
-        <w:t xml:space="preserve">Batata.</w:t>
-      </w:r>
-      <w:r>
-        <w:t xml:space="preserve"> </w:t>
-      </w:r>
-      <w:r>
-        <w:t xml:space="preserve">Los compuestos fenólicos (1.368 documentos; 477 vinculados a residuos), los flavonoides (760) y las antocianinas (1.613 documentos; 601 con procesos de extracción o recuperación) obtienen los índices de priorización más altos. Le siguen los carotenoides (1.347) y el ácido clorogénico, este último con el mayor impacto por documento (34,5 citas) y un 47 % de trabajos basados en hojas, cáscaras u otros residuos.</w:t>
+        <w:t xml:space="preserve">Tema motor:</w:t>
+      </w:r>
+      <w:r>
+        <w:t xml:space="preserve"> </w:t>
+      </w:r>
+      <w:r>
+        <w:t xml:space="preserve">actividad antioxidante, flavonoides, ñame y diosgenina (C2).</w:t>
       </w:r>
     </w:p>
     <w:p>
@@ -5497,6 +5461,113 @@
         <w:numPr>
           <w:ilvl w:val="0"/>
           <w:numId w:val="1013"/>
+        </w:numPr>
+        <w:pStyle w:val="Compact"/>
+      </w:pPr>
+      <w:r>
+        <w:rPr>
+          <w:bCs/>
+          <w:b/>
+        </w:rPr>
+        <w:t xml:space="preserve">Tema básico:</w:t>
+      </w:r>
+      <w:r>
+        <w:t xml:space="preserve"> </w:t>
+      </w:r>
+      <w:r>
+        <w:t xml:space="preserve">batata, antocianinas y batata de pulpa morada o naranja (C1).</w:t>
+      </w:r>
+    </w:p>
+    <w:p>
+      <w:pPr>
+        <w:numPr>
+          <w:ilvl w:val="0"/>
+          <w:numId w:val="1013"/>
+        </w:numPr>
+        <w:pStyle w:val="Compact"/>
+      </w:pPr>
+      <w:r>
+        <w:rPr>
+          <w:bCs/>
+          <w:b/>
+        </w:rPr>
+        <w:t xml:space="preserve">Nicho:</w:t>
+      </w:r>
+      <w:r>
+        <w:t xml:space="preserve"> </w:t>
+      </w:r>
+      <w:r>
+        <w:t xml:space="preserve">almidón de batata y de</w:t>
+      </w:r>
+      <w:r>
+        <w:t xml:space="preserve"> </w:t>
+      </w:r>
+      <w:r>
+        <w:rPr>
+          <w:iCs/>
+          <w:i/>
+        </w:rPr>
+        <w:t xml:space="preserve">D. alata</w:t>
+      </w:r>
+      <w:r>
+        <w:t xml:space="preserve"> </w:t>
+      </w:r>
+      <w:r>
+        <w:t xml:space="preserve">y sus propiedades funcionales (C3).</w:t>
+      </w:r>
+    </w:p>
+    <w:p>
+      <w:pPr>
+        <w:pStyle w:val="FirstParagraph"/>
+      </w:pPr>
+      <w:r>
+        <w:t xml:space="preserve">Desde 2000, la proporción de documentos sobre actividad antioxidante pasó del 10,3 % al 16,8 %, la de flavonoides del 4,8 % al 9,3 % y la de alimentos funcionales del 2,5 % al 7,1 %. La diosgenina, en cambio, bajó del 7,3 % al 4,1 %.</w:t>
+      </w:r>
+    </w:p>
+    <w:bookmarkStart w:id="50" w:name="metabolitos-candidatos"/>
+    <w:p>
+      <w:pPr>
+        <w:pStyle w:val="Heading3"/>
+      </w:pPr>
+      <w:r>
+        <w:t xml:space="preserve">Metabolitos candidatos</w:t>
+      </w:r>
+    </w:p>
+    <w:p>
+      <w:pPr>
+        <w:pStyle w:val="FirstParagraph"/>
+      </w:pPr>
+      <w:r>
+        <w:t xml:space="preserve">La minería de metabolitos (Tabla 4, Figura 6) muestra resultados distintos para cada cultivo.</w:t>
+      </w:r>
+    </w:p>
+    <w:p>
+      <w:pPr>
+        <w:numPr>
+          <w:ilvl w:val="0"/>
+          <w:numId w:val="1014"/>
+        </w:numPr>
+        <w:pStyle w:val="Compact"/>
+      </w:pPr>
+      <w:r>
+        <w:rPr>
+          <w:bCs/>
+          <w:b/>
+        </w:rPr>
+        <w:t xml:space="preserve">Batata.</w:t>
+      </w:r>
+      <w:r>
+        <w:t xml:space="preserve"> </w:t>
+      </w:r>
+      <w:r>
+        <w:t xml:space="preserve">Los compuestos fenólicos (1.368 documentos; 477 vinculados a residuos), los flavonoides (760) y las antocianinas (1.613 documentos; 601 con procesos de extracción o recuperación) obtienen los índices de priorización más altos. Le siguen los carotenoides (1.347) y el ácido clorogénico, este último con el mayor impacto por documento (34,5 citas) y un 47 % de trabajos basados en hojas, cáscaras u otros residuos.</w:t>
+      </w:r>
+    </w:p>
+    <w:p>
+      <w:pPr>
+        <w:numPr>
+          <w:ilvl w:val="0"/>
+          <w:numId w:val="1014"/>
         </w:numPr>
         <w:pStyle w:val="Compact"/>
       </w:pPr>
@@ -8156,86 +8227,12 @@
       <w:pPr>
         <w:numPr>
           <w:ilvl w:val="0"/>
-          <w:numId w:val="1014"/>
+          <w:numId w:val="1015"/>
         </w:numPr>
         <w:pStyle w:val="Compact"/>
       </w:pPr>
       <w:r>
         <w:t xml:space="preserve">Extracción del metabolito de alto valor a partir del tubérculo de descarte o de la cáscara.</w:t>
-      </w:r>
-    </w:p>
-    <w:p>
-      <w:pPr>
-        <w:numPr>
-          <w:ilvl w:val="0"/>
-          <w:numId w:val="1014"/>
-        </w:numPr>
-        <w:pStyle w:val="Compact"/>
-      </w:pPr>
-      <w:r>
-        <w:t xml:space="preserve">Recuperación de almidón nativo del residuo de extracción. Ochoa et al. (2023) y Quiñonez-Ensuncho et al. (2026) mostraron que el almidón residual conserva su valor.</w:t>
-      </w:r>
-    </w:p>
-    <w:p>
-      <w:pPr>
-        <w:numPr>
-          <w:ilvl w:val="0"/>
-          <w:numId w:val="1014"/>
-        </w:numPr>
-        <w:pStyle w:val="Compact"/>
-      </w:pPr>
-      <w:r>
-        <w:t xml:space="preserve">Hidrólisis y fermentación del almidón no comercializable y de los descartes a bioetanol.</w:t>
-      </w:r>
-    </w:p>
-    <w:p>
-      <w:pPr>
-        <w:numPr>
-          <w:ilvl w:val="0"/>
-          <w:numId w:val="1014"/>
-        </w:numPr>
-        <w:pStyle w:val="Compact"/>
-      </w:pPr>
-      <w:r>
-        <w:t xml:space="preserve">Digestión anaerobia de vinazas, cáscaras y ramas para obtener biogás y cogenerar energía (Montoro et al., 2019; Onu et al., 2022; Zhang et al., 2018).</w:t>
-      </w:r>
-    </w:p>
-    <w:p>
-      <w:pPr>
-        <w:numPr>
-          <w:ilvl w:val="0"/>
-          <w:numId w:val="1014"/>
-        </w:numPr>
-        <w:pStyle w:val="Compact"/>
-      </w:pPr>
-      <w:r>
-        <w:t xml:space="preserve">Acondicionamiento del digestato como biofertilizante.</w:t>
-      </w:r>
-    </w:p>
-    <w:p>
-      <w:pPr>
-        <w:pStyle w:val="FirstParagraph"/>
-      </w:pPr>
-      <w:r>
-        <w:t xml:space="preserve">La ruta del biofertilizante es la menos documentada como producto: la tesis deberá caracterizar el digestato y el compost (nutrientes, estabilidad, inocuidad), en lugar de asumir su valor comercial. Del mismo modo, como el ñame carece de casi todo ACV, el inventario de ciclo de vida exige datos primarios de San Jacinto (rendimientos, fertilización, transporte y pérdidas poscosecha).</w:t>
-      </w:r>
-    </w:p>
-    <w:bookmarkEnd w:id="63"/>
-    <w:bookmarkStart w:id="64" w:name="selección-de-los-metabolitos"/>
-    <w:p>
-      <w:pPr>
-        <w:pStyle w:val="Heading2"/>
-      </w:pPr>
-      <w:r>
-        <w:t xml:space="preserve">4.4 Selección de los metabolitos</w:t>
-      </w:r>
-    </w:p>
-    <w:p>
-      <w:pPr>
-        <w:pStyle w:val="FirstParagraph"/>
-      </w:pPr>
-      <w:r>
-        <w:t xml:space="preserve">La priorización ofrece un criterio cuantitativo para los metabolitos «por definir», que deberá confirmarse con la caracterización del material vegetal local:</w:t>
       </w:r>
     </w:p>
     <w:p>
@@ -8247,17 +8244,7 @@
         <w:pStyle w:val="Compact"/>
       </w:pPr>
       <w:r>
-        <w:rPr>
-          <w:bCs/>
-          <w:b/>
-        </w:rPr>
-        <w:t xml:space="preserve">Batata.</w:t>
-      </w:r>
-      <w:r>
-        <w:t xml:space="preserve"> </w:t>
-      </w:r>
-      <w:r>
-        <w:t xml:space="preserve">Los compuestos fenólicos y, dentro de ellos, las antocianinas y el ácido clorogénico combinan el mayor volumen de evidencia, una alta proporción de estudios con extracción desde residuos y aplicaciones industriales demostradas, como colorantes, empaques inteligentes y antioxidantes (Teow et al., 2007; Choi et al., 2017; Alam, 2021). La elección entre antocianinas y carotenoides depende de la variedad que se cultive en San Jacinto: las antocianinas son pertinentes para batata de pulpa morada y el β-caroteno para variedades de pulpa naranja, como Agrosavia Aurora. El ácido clorogénico es una alternativa que permite valorizar hojas y ramas, un residuo voluminoso del cultivo (Sun et al., 2014). La fibra y la pectina del residuo de extracción de almidón (Mei et al., 2010) y las proteínas o péptidos recuperables (Zhang et al., 2014) son coproductos secundarios.</w:t>
+        <w:t xml:space="preserve">Recuperación de almidón nativo del residuo de extracción. Ochoa et al. (2023) y Quiñonez-Ensuncho et al. (2026) mostraron que el almidón residual conserva su valor.</w:t>
       </w:r>
     </w:p>
     <w:p>
@@ -8269,91 +8256,49 @@
         <w:pStyle w:val="Compact"/>
       </w:pPr>
       <w:r>
-        <w:rPr>
-          <w:bCs/>
-          <w:b/>
-        </w:rPr>
-        <w:t xml:space="preserve">Ñame.</w:t>
-      </w:r>
-      <w:r>
-        <w:t xml:space="preserve"> </w:t>
-      </w:r>
-      <w:r>
-        <w:t xml:space="preserve">Aunque la diosgenina y las saponinas esteroidales dominan la literatura del género, su evidencia en</w:t>
-      </w:r>
-      <w:r>
-        <w:t xml:space="preserve"> </w:t>
-      </w:r>
-      <w:r>
-        <w:rPr>
-          <w:iCs/>
-          <w:i/>
-        </w:rPr>
-        <w:t xml:space="preserve">D. rotundata</w:t>
-      </w:r>
-      <w:r>
-        <w:t xml:space="preserve"> </w:t>
-      </w:r>
-      <w:r>
-        <w:t xml:space="preserve">es mínima (5 documentos) y procede de especies medicinales con contenidos mucho mayores. Por ello, para el ñame de San Jacinto se recomienda priorizar el</w:t>
-      </w:r>
-      <w:r>
-        <w:t xml:space="preserve"> </w:t>
-      </w:r>
-      <w:r>
-        <w:rPr>
-          <w:bCs/>
-          <w:b/>
-        </w:rPr>
-        <w:t xml:space="preserve">extracto fenólico o de flavonoides</w:t>
-      </w:r>
-      <w:r>
-        <w:t xml:space="preserve"> </w:t>
-      </w:r>
-      <w:r>
-        <w:t xml:space="preserve">a partir de cáscaras, que es el grupo con más evidencia específica en</w:t>
-      </w:r>
-      <w:r>
-        <w:t xml:space="preserve"> </w:t>
-      </w:r>
-      <w:r>
-        <w:rPr>
-          <w:iCs/>
-          <w:i/>
-        </w:rPr>
-        <w:t xml:space="preserve">D. rotundata</w:t>
-      </w:r>
-      <w:r>
-        <w:t xml:space="preserve"> </w:t>
-      </w:r>
-      <w:r>
-        <w:t xml:space="preserve">(52 documentos) y una tendencia creciente (Adomėnienė y Venskutonis, 2022). Como segunda opción, los</w:t>
-      </w:r>
-      <w:r>
-        <w:t xml:space="preserve"> </w:t>
-      </w:r>
-      <w:r>
-        <w:rPr>
-          <w:bCs/>
-          <w:b/>
-        </w:rPr>
-        <w:t xml:space="preserve">polisacáridos no amiláceos o mucílago</w:t>
-      </w:r>
-      <w:r>
-        <w:t xml:space="preserve"> </w:t>
-      </w:r>
-      <w:r>
-        <w:t xml:space="preserve">de la cáscara, con propiedades funcionales documentadas (Zhao et al., 2023). La dioscorina (Hou et al., 2001) y la alantoína (Fu et al., 2006) son alternativas de alto valor, pero con evidencia insuficiente para un diseño conceptual sin experimentación previa.</w:t>
-      </w:r>
-    </w:p>
-    <w:bookmarkEnd w:id="64"/>
-    <w:bookmarkStart w:id="65" w:name="X6ee106b22f62b72e01e1dd84a48def7585e3d18"/>
+        <w:t xml:space="preserve">Hidrólisis y fermentación del almidón no comercializable y de los descartes a bioetanol.</w:t>
+      </w:r>
+    </w:p>
+    <w:p>
+      <w:pPr>
+        <w:numPr>
+          <w:ilvl w:val="0"/>
+          <w:numId w:val="1015"/>
+        </w:numPr>
+        <w:pStyle w:val="Compact"/>
+      </w:pPr>
+      <w:r>
+        <w:t xml:space="preserve">Digestión anaerobia de vinazas, cáscaras y ramas para obtener biogás y cogenerar energía (Montoro et al., 2019; Onu et al., 2022; Zhang et al., 2018).</w:t>
+      </w:r>
+    </w:p>
+    <w:p>
+      <w:pPr>
+        <w:numPr>
+          <w:ilvl w:val="0"/>
+          <w:numId w:val="1015"/>
+        </w:numPr>
+        <w:pStyle w:val="Compact"/>
+      </w:pPr>
+      <w:r>
+        <w:t xml:space="preserve">Acondicionamiento del digestato como biofertilizante.</w:t>
+      </w:r>
+    </w:p>
+    <w:p>
+      <w:pPr>
+        <w:pStyle w:val="FirstParagraph"/>
+      </w:pPr>
+      <w:r>
+        <w:t xml:space="preserve">La ruta del biofertilizante es la menos documentada como producto: la tesis deberá caracterizar el digestato y el compost (nutrientes, estabilidad, inocuidad), en lugar de asumir su valor comercial. Del mismo modo, como el ñame carece de casi todo ACV, el inventario de ciclo de vida exige datos primarios de San Jacinto (rendimientos, fertilización, transporte y pérdidas poscosecha).</w:t>
+      </w:r>
+    </w:p>
+    <w:bookmarkEnd w:id="63"/>
+    <w:bookmarkStart w:id="64" w:name="selección-de-los-metabolitos"/>
     <w:p>
       <w:pPr>
         <w:pStyle w:val="Heading2"/>
       </w:pPr>
       <w:r>
-        <w:t xml:space="preserve">4.5 Implicaciones para el ACV-S y el contexto territorial</w:t>
+        <w:t xml:space="preserve">4.4 Selección de los metabolitos</w:t>
       </w:r>
     </w:p>
     <w:p>
@@ -8361,17 +8306,7 @@
         <w:pStyle w:val="FirstParagraph"/>
       </w:pPr>
       <w:r>
-        <w:t xml:space="preserve">El análisis de N6 muestra que Colombia cuenta con una escuela consolidada de diseño y evaluación de biorrefinerías (Moncada B. et al., 2016; Poveda-Giraldo et al., 2021) y con grupos regionales que estudian el ñame del Caribe desde la agronomía, la poscosecha y la cadena de suministro. Ambas comunidades, sin embargo, no se han encontrado. Una evaluación integrada en San Jacinto conecta esos dos nichos y aborda problemas sociales documentados en la región: la fragilidad de la cadena exportadora (Granados Conde et al., 2026), las pérdidas logísticas (Vergara Rodríguez et al., 2025) y la importancia de la asociatividad productiva (Mendoza-Crespo y Ortiz-Velásquez, 2020). Estos problemas sugieren subcategorías prioritarias para el ACV-S: ingresos justos y estabilidad de precios para agricultores, empleo local y condiciones de trabajo en la planta, acceso a recursos materiales e infraestructura comunitaria, y seguridad alimentaria.</w:t>
-      </w:r>
-    </w:p>
-    <w:bookmarkEnd w:id="65"/>
-    <w:bookmarkStart w:id="66" w:name="limitaciones"/>
-    <w:p>
-      <w:pPr>
-        <w:pStyle w:val="Heading2"/>
-      </w:pPr>
-      <w:r>
-        <w:t xml:space="preserve">4.6 Limitaciones</w:t>
+        <w:t xml:space="preserve">La priorización ofrece un criterio cuantitativo para los metabolitos «por definir», que deberá confirmarse con la caracterización del material vegetal local:</w:t>
       </w:r>
     </w:p>
     <w:p>
@@ -8383,7 +8318,17 @@
         <w:pStyle w:val="Compact"/>
       </w:pPr>
       <w:r>
-        <w:t xml:space="preserve">La búsqueda en título y resumen no recupera los documentos que tratan el tema solo en el texto completo, y parte de los resúmenes no está disponible en OpenAlex. La fusión con Scopus mitigó esta limitación (entre el 91,4 % y el 99,3 % de los DOI de Scopus se enlazaron), pero no la elimina.</w:t>
+        <w:rPr>
+          <w:bCs/>
+          <w:b/>
+        </w:rPr>
+        <w:t xml:space="preserve">Batata.</w:t>
+      </w:r>
+      <w:r>
+        <w:t xml:space="preserve"> </w:t>
+      </w:r>
+      <w:r>
+        <w:t xml:space="preserve">Los compuestos fenólicos y, dentro de ellos, las antocianinas y el ácido clorogénico combinan el mayor volumen de evidencia, una alta proporción de estudios con extracción desde residuos y aplicaciones industriales demostradas, como colorantes, empaques inteligentes y antioxidantes (Teow et al., 2007; Choi et al., 2017; Alam, 2021). La elección entre antocianinas y carotenoides depende de la variedad que se cultive en San Jacinto: las antocianinas son pertinentes para batata de pulpa morada y el β-caroteno para variedades de pulpa naranja, como Agrosavia Aurora. El ácido clorogénico es una alternativa que permite valorizar hojas y ramas, un residuo voluminoso del cultivo (Sun et al., 2014). La fibra y la pectina del residuo de extracción de almidón (Mei et al., 2010) y las proteínas o péptidos recuperables (Zhang et al., 2014) son coproductos secundarios.</w:t>
       </w:r>
     </w:p>
     <w:p>
@@ -8395,54 +8340,109 @@
         <w:pStyle w:val="Compact"/>
       </w:pPr>
       <w:r>
-        <w:t xml:space="preserve">La API de Scopus se usó en su vista restringida, por lo que los registros de Scopus no enlazables (1.082) no aportan autores ni afiliaciones.</w:t>
-      </w:r>
-    </w:p>
-    <w:p>
-      <w:pPr>
-        <w:numPr>
-          <w:ilvl w:val="0"/>
-          <w:numId w:val="1016"/>
-        </w:numPr>
-        <w:pStyle w:val="Compact"/>
-      </w:pPr>
-      <w:r>
-        <w:t xml:space="preserve">La clasificación por diccionarios y las palabras clave de OpenAlex, asignadas automáticamente, introducen ruido. En N5 persisten documentos donde el cultivo se menciona de forma incidental. Esos documentos no se excluyeron manualmente, para preservar la reproducibilidad, y no se usaron en la interpretación cualitativa.</w:t>
-      </w:r>
-    </w:p>
-    <w:p>
-      <w:pPr>
-        <w:numPr>
-          <w:ilvl w:val="0"/>
-          <w:numId w:val="1016"/>
-        </w:numPr>
-        <w:pStyle w:val="Compact"/>
-      </w:pPr>
-      <w:r>
-        <w:t xml:space="preserve">La literatura gris (informes de AGROSAVIA, MADR, ICA y tesis) no forma parte del análisis bibliométrico.</w:t>
-      </w:r>
-    </w:p>
-    <w:p>
-      <w:pPr>
-        <w:numPr>
-          <w:ilvl w:val="0"/>
-          <w:numId w:val="1016"/>
-        </w:numPr>
-        <w:pStyle w:val="Compact"/>
-      </w:pPr>
-      <w:r>
-        <w:t xml:space="preserve">2026 es un año parcial, por lo que las tasas de crecimiento se calcularon hasta 2025.</w:t>
-      </w:r>
-    </w:p>
-    <w:bookmarkEnd w:id="66"/>
-    <w:bookmarkEnd w:id="67"/>
-    <w:bookmarkStart w:id="68" w:name="conclusiones"/>
-    <w:p>
-      <w:pPr>
-        <w:pStyle w:val="Heading1"/>
-      </w:pPr>
-      <w:r>
-        <w:t xml:space="preserve">5. Conclusiones</w:t>
+        <w:rPr>
+          <w:bCs/>
+          <w:b/>
+        </w:rPr>
+        <w:t xml:space="preserve">Ñame.</w:t>
+      </w:r>
+      <w:r>
+        <w:t xml:space="preserve"> </w:t>
+      </w:r>
+      <w:r>
+        <w:t xml:space="preserve">Aunque la diosgenina y las saponinas esteroidales dominan la literatura del género, su evidencia en</w:t>
+      </w:r>
+      <w:r>
+        <w:t xml:space="preserve"> </w:t>
+      </w:r>
+      <w:r>
+        <w:rPr>
+          <w:iCs/>
+          <w:i/>
+        </w:rPr>
+        <w:t xml:space="preserve">D. rotundata</w:t>
+      </w:r>
+      <w:r>
+        <w:t xml:space="preserve"> </w:t>
+      </w:r>
+      <w:r>
+        <w:t xml:space="preserve">es mínima (5 documentos) y procede de especies medicinales con contenidos mucho mayores. Por ello, para el ñame de San Jacinto se recomienda priorizar el</w:t>
+      </w:r>
+      <w:r>
+        <w:t xml:space="preserve"> </w:t>
+      </w:r>
+      <w:r>
+        <w:rPr>
+          <w:bCs/>
+          <w:b/>
+        </w:rPr>
+        <w:t xml:space="preserve">extracto fenólico o de flavonoides</w:t>
+      </w:r>
+      <w:r>
+        <w:t xml:space="preserve"> </w:t>
+      </w:r>
+      <w:r>
+        <w:t xml:space="preserve">a partir de cáscaras, que es el grupo con más evidencia específica en</w:t>
+      </w:r>
+      <w:r>
+        <w:t xml:space="preserve"> </w:t>
+      </w:r>
+      <w:r>
+        <w:rPr>
+          <w:iCs/>
+          <w:i/>
+        </w:rPr>
+        <w:t xml:space="preserve">D. rotundata</w:t>
+      </w:r>
+      <w:r>
+        <w:t xml:space="preserve"> </w:t>
+      </w:r>
+      <w:r>
+        <w:t xml:space="preserve">(52 documentos) y una tendencia creciente (Adomėnienė y Venskutonis, 2022). Como segunda opción, los</w:t>
+      </w:r>
+      <w:r>
+        <w:t xml:space="preserve"> </w:t>
+      </w:r>
+      <w:r>
+        <w:rPr>
+          <w:bCs/>
+          <w:b/>
+        </w:rPr>
+        <w:t xml:space="preserve">polisacáridos no amiláceos o mucílago</w:t>
+      </w:r>
+      <w:r>
+        <w:t xml:space="preserve"> </w:t>
+      </w:r>
+      <w:r>
+        <w:t xml:space="preserve">de la cáscara, con propiedades funcionales documentadas (Zhao et al., 2023). La dioscorina (Hou et al., 2001) y la alantoína (Fu et al., 2006) son alternativas de alto valor, pero con evidencia insuficiente para un diseño conceptual sin experimentación previa.</w:t>
+      </w:r>
+    </w:p>
+    <w:bookmarkEnd w:id="64"/>
+    <w:bookmarkStart w:id="65" w:name="X6ee106b22f62b72e01e1dd84a48def7585e3d18"/>
+    <w:p>
+      <w:pPr>
+        <w:pStyle w:val="Heading2"/>
+      </w:pPr>
+      <w:r>
+        <w:t xml:space="preserve">4.5 Implicaciones para el ACV-S y el contexto territorial</w:t>
+      </w:r>
+    </w:p>
+    <w:p>
+      <w:pPr>
+        <w:pStyle w:val="FirstParagraph"/>
+      </w:pPr>
+      <w:r>
+        <w:t xml:space="preserve">El análisis de N6 muestra que Colombia cuenta con una escuela consolidada de diseño y evaluación de biorrefinerías (Moncada B. et al., 2016; Poveda-Giraldo et al., 2021) y con grupos regionales que estudian el ñame del Caribe desde la agronomía, la poscosecha y la cadena de suministro. Ambas comunidades, sin embargo, no se han encontrado. Una evaluación integrada en San Jacinto conecta esos dos nichos y aborda problemas sociales documentados en la región: la fragilidad de la cadena exportadora (Granados Conde et al., 2026), las pérdidas logísticas (Vergara Rodríguez et al., 2025) y la importancia de la asociatividad productiva (Mendoza-Crespo y Ortiz-Velásquez, 2020). Estos problemas sugieren subcategorías prioritarias para el ACV-S: ingresos justos y estabilidad de precios para agricultores, empleo local y condiciones de trabajo en la planta, acceso a recursos materiales e infraestructura comunitaria, y seguridad alimentaria.</w:t>
+      </w:r>
+    </w:p>
+    <w:bookmarkEnd w:id="65"/>
+    <w:bookmarkStart w:id="66" w:name="limitaciones"/>
+    <w:p>
+      <w:pPr>
+        <w:pStyle w:val="Heading2"/>
+      </w:pPr>
+      <w:r>
+        <w:t xml:space="preserve">4.6 Limitaciones</w:t>
       </w:r>
     </w:p>
     <w:p>
@@ -8454,7 +8454,7 @@
         <w:pStyle w:val="Compact"/>
       </w:pPr>
       <w:r>
-        <w:t xml:space="preserve">La evaluación de sostenibilidad de biorrefinerías crece a una tasa anual compuesta del 29,2 % y se estructura alrededor del ACV y el TEA de biomasa lignocelulósica, con un giro reciente hacia la bioeconomía circular. Colombia es un actor relevante del campo: ocupa el noveno lugar mundial y aporta al autor más productivo.</w:t>
+        <w:t xml:space="preserve">La búsqueda en título y resumen no recupera los documentos que tratan el tema solo en el texto completo, y parte de los resúmenes no está disponible en OpenAlex. La fusión con Scopus mitigó esta limitación (entre el 91,4 % y el 99,3 % de los DOI de Scopus se enlazaron), pero no la elimina.</w:t>
       </w:r>
     </w:p>
     <w:p>
@@ -8466,7 +8466,7 @@
         <w:pStyle w:val="Compact"/>
       </w:pPr>
       <w:r>
-        <w:t xml:space="preserve">La dimensión social es el pilar menos desarrollado (159 documentos sobre ACV-S o LCSA en sistemas de base biológica), con aplicaciones concentradas en Europa y en materias primas no amiláceas.</w:t>
+        <w:t xml:space="preserve">La API de Scopus se usó en su vista restringida, por lo que los registros de Scopus no enlazables (1.082) no aportan autores ni afiliaciones.</w:t>
       </w:r>
     </w:p>
     <w:p>
@@ -8478,7 +8478,7 @@
         <w:pStyle w:val="Compact"/>
       </w:pPr>
       <w:r>
-        <w:t xml:space="preserve">Entre las raíces y los tubérculos, la yuca concentra la investigación sobre rutas energéticas y evaluación de sostenibilidad. El ñame y la batata concentran su literatura en almidón y compuestos bioactivos, con muy pocos ACV (7 y 21) y TEA (20 y 39), y sin ningún ACV-S.</w:t>
+        <w:t xml:space="preserve">La clasificación por diccionarios y las palabras clave de OpenAlex, asignadas automáticamente, introducen ruido. En N5 persisten documentos donde el cultivo se menciona de forma incidental. Esos documentos no se excluyeron manualmente, para preservar la reproducibilidad, y no se usaron en la interpretación cualitativa.</w:t>
       </w:r>
     </w:p>
     <w:p>
@@ -8490,7 +8490,7 @@
         <w:pStyle w:val="Compact"/>
       </w:pPr>
       <w:r>
-        <w:t xml:space="preserve">No existe en la literatura indexada ninguna evaluación que integre ACV, TEA y ACV-S para biorrefinerías de tubérculos. Solo 7 documentos sobre ñame y 15 sobre batata combinan tres o más de las rutas fijas. Este es el vacío de investigación que aborda la tesis.</w:t>
+        <w:t xml:space="preserve">La literatura gris (informes de AGROSAVIA, MADR, ICA y tesis) no forma parte del análisis bibliométrico.</w:t>
       </w:r>
     </w:p>
     <w:p>
@@ -8502,7 +8502,7 @@
         <w:pStyle w:val="Compact"/>
       </w:pPr>
       <w:r>
-        <w:t xml:space="preserve">La evidencia bibliométrica respalda una configuración en cascada (metabolito → almidón → bioetanol → biogás → biofertilizante). Como metabolitos se priorizan los compuestos fenólicos o flavonoides de la cáscara para el ñame y las antocianinas, el ácido clorogénico o el β-caroteno (según la variedad) para la batata. La selección final requiere caracterizar la biomasa de San Jacinto.</w:t>
+        <w:t xml:space="preserve">2026 es un año parcial, por lo que las tasas de crecimiento se calcularon hasta 2025.</w:t>
       </w:r>
     </w:p>
     <w:p>
@@ -8510,6 +8510,89 @@
         <w:numPr>
           <w:ilvl w:val="0"/>
           <w:numId w:val="1017"/>
+        </w:numPr>
+        <w:pStyle w:val="Compact"/>
+      </w:pPr>
+      <w:r>
+        <w:t xml:space="preserve">El corte en el año 2000 excluye una fracción pequeña de la literatura de cultivo (entre el 1,6 % y el 10,5 % según la consulta). Esa exclusión no afecta a los niveles de sostenibilidad (N1, N2), pero subrepresenta la literatura histórica sobre la diosgenina del ñame.</w:t>
+      </w:r>
+    </w:p>
+    <w:bookmarkEnd w:id="66"/>
+    <w:bookmarkEnd w:id="67"/>
+    <w:bookmarkStart w:id="68" w:name="conclusiones"/>
+    <w:p>
+      <w:pPr>
+        <w:pStyle w:val="Heading1"/>
+      </w:pPr>
+      <w:r>
+        <w:t xml:space="preserve">5. Conclusiones</w:t>
+      </w:r>
+    </w:p>
+    <w:p>
+      <w:pPr>
+        <w:numPr>
+          <w:ilvl w:val="0"/>
+          <w:numId w:val="1018"/>
+        </w:numPr>
+        <w:pStyle w:val="Compact"/>
+      </w:pPr>
+      <w:r>
+        <w:t xml:space="preserve">La evaluación de sostenibilidad de biorrefinerías crece a una tasa anual compuesta del 29,2 % y se estructura alrededor del ACV y el TEA de biomasa lignocelulósica, con un giro reciente hacia la bioeconomía circular. Colombia es un actor relevante del campo: ocupa el noveno lugar mundial y aporta al autor más productivo.</w:t>
+      </w:r>
+    </w:p>
+    <w:p>
+      <w:pPr>
+        <w:numPr>
+          <w:ilvl w:val="0"/>
+          <w:numId w:val="1018"/>
+        </w:numPr>
+        <w:pStyle w:val="Compact"/>
+      </w:pPr>
+      <w:r>
+        <w:t xml:space="preserve">La dimensión social es el pilar menos desarrollado (159 documentos sobre ACV-S o LCSA en sistemas de base biológica), con aplicaciones concentradas en Europa y en materias primas no amiláceas.</w:t>
+      </w:r>
+    </w:p>
+    <w:p>
+      <w:pPr>
+        <w:numPr>
+          <w:ilvl w:val="0"/>
+          <w:numId w:val="1018"/>
+        </w:numPr>
+        <w:pStyle w:val="Compact"/>
+      </w:pPr>
+      <w:r>
+        <w:t xml:space="preserve">Entre las raíces y los tubérculos, la yuca concentra la investigación sobre rutas energéticas y evaluación de sostenibilidad. El ñame y la batata concentran su literatura en almidón y compuestos bioactivos, con muy pocos ACV (7 y 21) y TEA (20 y 39), y sin ningún ACV-S.</w:t>
+      </w:r>
+    </w:p>
+    <w:p>
+      <w:pPr>
+        <w:numPr>
+          <w:ilvl w:val="0"/>
+          <w:numId w:val="1018"/>
+        </w:numPr>
+        <w:pStyle w:val="Compact"/>
+      </w:pPr>
+      <w:r>
+        <w:t xml:space="preserve">No existe en la literatura indexada ninguna evaluación que integre ACV, TEA y ACV-S para biorrefinerías de tubérculos. Solo 7 documentos sobre ñame y 15 sobre batata combinan tres o más de las rutas fijas. Este es el vacío de investigación que aborda la tesis.</w:t>
+      </w:r>
+    </w:p>
+    <w:p>
+      <w:pPr>
+        <w:numPr>
+          <w:ilvl w:val="0"/>
+          <w:numId w:val="1018"/>
+        </w:numPr>
+        <w:pStyle w:val="Compact"/>
+      </w:pPr>
+      <w:r>
+        <w:t xml:space="preserve">La evidencia bibliométrica respalda una configuración en cascada (metabolito → almidón → bioetanol → biogás → biofertilizante). Como metabolitos se priorizan los compuestos fenólicos o flavonoides de la cáscara para el ñame y las antocianinas, el ácido clorogénico o el β-caroteno (según la variedad) para la batata. La selección final requiere caracterizar la biomasa de San Jacinto.</w:t>
+      </w:r>
+    </w:p>
+    <w:p>
+      <w:pPr>
+        <w:numPr>
+          <w:ilvl w:val="0"/>
+          <w:numId w:val="1018"/>
         </w:numPr>
         <w:pStyle w:val="Compact"/>
       </w:pPr>
@@ -11749,7 +11832,34 @@
     </w:lvlOverride>
   </w:num>
   <w:num w:numId="1004">
-    <w:abstractNumId w:val="991"/>
+    <w:abstractNumId w:val="99411"/>
+    <w:lvlOverride w:ilvl="0">
+      <w:startOverride w:val="1"/>
+    </w:lvlOverride>
+    <w:lvlOverride w:ilvl="1">
+      <w:startOverride w:val="1"/>
+    </w:lvlOverride>
+    <w:lvlOverride w:ilvl="2">
+      <w:startOverride w:val="1"/>
+    </w:lvlOverride>
+    <w:lvlOverride w:ilvl="3">
+      <w:startOverride w:val="1"/>
+    </w:lvlOverride>
+    <w:lvlOverride w:ilvl="4">
+      <w:startOverride w:val="1"/>
+    </w:lvlOverride>
+    <w:lvlOverride w:ilvl="5">
+      <w:startOverride w:val="1"/>
+    </w:lvlOverride>
+    <w:lvlOverride w:ilvl="6">
+      <w:startOverride w:val="1"/>
+    </w:lvlOverride>
+    <w:lvlOverride w:ilvl="7">
+      <w:startOverride w:val="1"/>
+    </w:lvlOverride>
+    <w:lvlOverride w:ilvl="8">
+      <w:startOverride w:val="1"/>
+    </w:lvlOverride>
   </w:num>
   <w:num w:numId="1005">
     <w:abstractNumId w:val="991"/>
@@ -11779,6 +11889,9 @@
     <w:abstractNumId w:val="991"/>
   </w:num>
   <w:num w:numId="1014">
+    <w:abstractNumId w:val="991"/>
+  </w:num>
+  <w:num w:numId="1015">
     <w:abstractNumId w:val="99411"/>
     <w:lvlOverride w:ilvl="0">
       <w:startOverride w:val="1"/>
@@ -11808,10 +11921,10 @@
       <w:startOverride w:val="1"/>
     </w:lvlOverride>
   </w:num>
-  <w:num w:numId="1015">
+  <w:num w:numId="1016">
     <w:abstractNumId w:val="991"/>
   </w:num>
-  <w:num w:numId="1016">
+  <w:num w:numId="1017">
     <w:abstractNumId w:val="99411"/>
     <w:lvlOverride w:ilvl="0">
       <w:startOverride w:val="1"/>
@@ -11841,7 +11954,7 @@
       <w:startOverride w:val="1"/>
     </w:lvlOverride>
   </w:num>
-  <w:num w:numId="1017">
+  <w:num w:numId="1018">
     <w:abstractNumId w:val="99411"/>
     <w:lvlOverride w:ilvl="0">
       <w:startOverride w:val="1"/>

</xml_diff>